<commit_message>
refactor: doi ky hieu S-curve theo dung paper (T1..T7, v_start/v_m/v_end, eq numbers trong comment); bo trick dao thoi gian; verify CSV lech <=1 don vi lam tron
</commit_message>
<xml_diff>
--- a/Tuần 3/Trí/CONVENTIONS.docx
+++ b/Tuần 3/Trí/CONVENTIONS.docx
@@ -229,10 +229,66 @@
           <w:ilvl w:val="0"/>
           <w:numId w:val="1003"/>
         </w:numPr>
-        <w:pStyle w:val="Compact"/>
-      </w:pPr>
-      <w:r>
-        <w:t xml:space="preserve">Hằng số ALLCAPS, tên đầy đủ dễ đọc: MAX_ACCELERATION (không phải ACCEL_MM_S2).</w:t>
+      </w:pPr>
+      <w:r>
+        <w:rPr>
+          <w:b/>
+        </w:rPr>
+        <w:t xml:space="preserve">Code bám paper thì KÝ HIỆU ĐẶT THEO PAPER</w:t>
+      </w:r>
+      <w:r>
+        <w:t xml:space="preserve"> </w:t>
+      </w:r>
+      <w:r>
+        <w:t xml:space="preserve">(T1..T7, v_start, v_m, v_end, A, D, J</w:t>
+      </w:r>
+      <w:r>
+        <w:t xml:space="preserve"> </w:t>
+      </w:r>
+      <w:r>
+        <w:t xml:space="preserve">— như Figure 1 của Chen 2013) và comment phải GHI SỐ CÔNG THỨC:</w:t>
+      </w:r>
+      <w:r>
+        <w:t xml:space="preserve"> </w:t>
+      </w:r>
+      <w:r>
+        <w:rPr>
+          <w:rStyle w:val="VerbatimChar"/>
+        </w:rPr>
+        <w:t xml:space="preserve">eq (1)</w:t>
+      </w:r>
+      <w:r>
+        <w:t xml:space="preserve">,</w:t>
+      </w:r>
+      <w:r>
+        <w:t xml:space="preserve"> </w:t>
+      </w:r>
+      <w:r>
+        <w:rPr>
+          <w:rStyle w:val="VerbatimChar"/>
+        </w:rPr>
+        <w:t xml:space="preserve">eq (8)</w:t>
+      </w:r>
+      <w:r>
+        <w:t xml:space="preserve">,</w:t>
+      </w:r>
+      <w:r>
+        <w:t xml:space="preserve"> </w:t>
+      </w:r>
+      <w:r>
+        <w:rPr>
+          <w:rStyle w:val="VerbatimChar"/>
+        </w:rPr>
+        <w:t xml:space="preserve">eq (17)</w:t>
+      </w:r>
+      <w:r>
+        <w:t xml:space="preserve">… để dò ngược về bài báo được. Khác paper chỗ nào (vd tick → thời gian</w:t>
+      </w:r>
+      <w:r>
+        <w:t xml:space="preserve"> </w:t>
+      </w:r>
+      <w:r>
+        <w:t xml:space="preserve">liên tục) thì khai ngay đầu section.</w:t>
       </w:r>
     </w:p>
     <w:p>
@@ -241,16 +297,54 @@
           <w:ilvl w:val="0"/>
           <w:numId w:val="1003"/>
         </w:numPr>
-        <w:pStyle w:val="Compact"/>
-      </w:pPr>
-      <w:r>
-        <w:t xml:space="preserve">Biến/field mang nghĩa vật lý + đơn vị ghi trong comment: v_entry, v_peak, v_exit</w:t>
-      </w:r>
-      <w:r>
-        <w:t xml:space="preserve"> </w:t>
-      </w:r>
-      <w:r>
-        <w:t xml:space="preserve">(mm/s); t_accel, t_cruise (s); angle_start, sweep (rad).</w:t>
+      </w:pPr>
+      <w:r>
+        <w:t xml:space="preserve">Biến binary search không đặt lo/hi — đặt theo nghĩa:</w:t>
+      </w:r>
+      <w:r>
+        <w:t xml:space="preserve"> </w:t>
+      </w:r>
+      <w:r>
+        <w:rPr>
+          <w:rStyle w:val="VerbatimChar"/>
+        </w:rPr>
+        <w:t xml:space="preserve">v_dat</w:t>
+      </w:r>
+      <w:r>
+        <w:t xml:space="preserve"> </w:t>
+      </w:r>
+      <w:r>
+        <w:t xml:space="preserve">(đã biết chắc đạt),</w:t>
+      </w:r>
+      <w:r>
+        <w:t xml:space="preserve"> </w:t>
+      </w:r>
+      <w:r>
+        <w:rPr>
+          <w:rStyle w:val="VerbatimChar"/>
+        </w:rPr>
+        <w:t xml:space="preserve">v_truot</w:t>
+      </w:r>
+      <w:r>
+        <w:t xml:space="preserve"> </w:t>
+      </w:r>
+      <w:r>
+        <w:t xml:space="preserve">(đã biết chắc vượt),</w:t>
+      </w:r>
+      <w:r>
+        <w:t xml:space="preserve"> </w:t>
+      </w:r>
+      <w:r>
+        <w:rPr>
+          <w:rStyle w:val="VerbatimChar"/>
+        </w:rPr>
+        <w:t xml:space="preserve">v_thu</w:t>
+      </w:r>
+      <w:r>
+        <w:t xml:space="preserve"> </w:t>
+      </w:r>
+      <w:r>
+        <w:t xml:space="preserve">(đang thử).</w:t>
       </w:r>
     </w:p>
     <w:p>
@@ -259,16 +353,9 @@
           <w:ilvl w:val="0"/>
           <w:numId w:val="1003"/>
         </w:numPr>
-        <w:pStyle w:val="Compact"/>
-      </w:pPr>
-      <w:r>
-        <w:t xml:space="preserve">KHÔNG dùng tên cụt kiểu v0/v1/A/T khi field đó sống lâu trong struct —</w:t>
-      </w:r>
-      <w:r>
-        <w:t xml:space="preserve"> </w:t>
-      </w:r>
-      <w:r>
-        <w:t xml:space="preserve">chấp nhận được cho biến local vòng đời ngắn trong 1 công thức.</w:t>
+      </w:pPr>
+      <w:r>
+        <w:t xml:space="preserve">Hằng số ALLCAPS, tên đầy đủ dễ đọc: MAX_ACCELERATION (không phải ACCEL_MM_S2).</w:t>
       </w:r>
     </w:p>
     <w:p>
@@ -277,7 +364,40 @@
           <w:ilvl w:val="0"/>
           <w:numId w:val="1003"/>
         </w:numPr>
-        <w:pStyle w:val="Compact"/>
+      </w:pPr>
+      <w:r>
+        <w:t xml:space="preserve">Biến/field mang nghĩa vật lý + đơn vị ghi trong comment: v_entry, v_peak, v_exit</w:t>
+      </w:r>
+      <w:r>
+        <w:t xml:space="preserve"> </w:t>
+      </w:r>
+      <w:r>
+        <w:t xml:space="preserve">(mm/s); t_accel, t_cruise (s); angle_start, sweep (rad).</w:t>
+      </w:r>
+    </w:p>
+    <w:p>
+      <w:pPr>
+        <w:numPr>
+          <w:ilvl w:val="0"/>
+          <w:numId w:val="1003"/>
+        </w:numPr>
+      </w:pPr>
+      <w:r>
+        <w:t xml:space="preserve">KHÔNG dùng tên cụt kiểu v0/v1/A/T khi field đó sống lâu trong struct —</w:t>
+      </w:r>
+      <w:r>
+        <w:t xml:space="preserve"> </w:t>
+      </w:r>
+      <w:r>
+        <w:t xml:space="preserve">chấp nhận được cho biến local vòng đời ngắn trong 1 công thức.</w:t>
+      </w:r>
+    </w:p>
+    <w:p>
+      <w:pPr>
+        <w:numPr>
+          <w:ilvl w:val="0"/>
+          <w:numId w:val="1003"/>
+        </w:numPr>
       </w:pPr>
       <w:r>
         <w:t xml:space="preserve">Tên nói rõ vai trò: read_cursor/write_cursor thay cho src/dst/p.</w:t>

</xml_diff>

<commit_message>
refactor: identifier tieng Anh (v_feasible/v_too_high/v_low/t_bound...), comment giu tieng Viet; CSV giong het tung byte
</commit_message>
<xml_diff>
--- a/Tuần 3/Trí/CONVENTIONS.docx
+++ b/Tuần 3/Trí/CONVENTIONS.docx
@@ -299,6 +299,26 @@
         </w:numPr>
       </w:pPr>
       <w:r>
+        <w:rPr>
+          <w:b/>
+        </w:rPr>
+        <w:t xml:space="preserve">Identifier (tên biến/hàm/struct) bằng TIẾNG ANH, comment bằng tiếng Việt.</w:t>
+      </w:r>
+      <w:r>
+        <w:t xml:space="preserve"> </w:t>
+      </w:r>
+      <w:r>
+        <w:t xml:space="preserve">Ngoại lệ duy nhất: ký hiệu lấy từ paper (T1..T7, v_m, A, D, J…) giữ nguyên.</w:t>
+      </w:r>
+    </w:p>
+    <w:p>
+      <w:pPr>
+        <w:numPr>
+          <w:ilvl w:val="0"/>
+          <w:numId w:val="1003"/>
+        </w:numPr>
+      </w:pPr>
+      <w:r>
         <w:t xml:space="preserve">Biến binary search không đặt lo/hi — đặt theo nghĩa:</w:t>
       </w:r>
       <w:r>
@@ -308,7 +328,7 @@
         <w:rPr>
           <w:rStyle w:val="VerbatimChar"/>
         </w:rPr>
-        <w:t xml:space="preserve">v_dat</w:t>
+        <w:t xml:space="preserve">v_feasible</w:t>
       </w:r>
       <w:r>
         <w:t xml:space="preserve"> </w:t>
@@ -323,7 +343,7 @@
         <w:rPr>
           <w:rStyle w:val="VerbatimChar"/>
         </w:rPr>
-        <w:t xml:space="preserve">v_truot</w:t>
+        <w:t xml:space="preserve">v_too_high</w:t>
       </w:r>
       <w:r>
         <w:t xml:space="preserve"> </w:t>
@@ -338,7 +358,7 @@
         <w:rPr>
           <w:rStyle w:val="VerbatimChar"/>
         </w:rPr>
-        <w:t xml:space="preserve">v_thu</w:t>
+        <w:t xml:space="preserve">v_try</w:t>
       </w:r>
       <w:r>
         <w:t xml:space="preserve"> </w:t>

</xml_diff>